<commit_message>
Refactor evaluation and submission templates for Model-Based Design course
- Updated the "Entrega de Trabalho" document structure to align with Átomo 3.0 standards, including renaming sections and clarifying submission guidelines.
- Introduced a new Python script to automate the filling of the final evaluation template, ensuring compliance with institutional formatting.
- Enhanced validation scripts to check for required sections and formatting in both the work submission and final evaluation documents.
- Added a new final evaluation template for the course, including 30 multiple-choice questions and 10 essay questions with feedback.
- Improved error handling and reporting in validation scripts to ensure clarity on missing or incorrectly formatted sections.
</commit_message>
<xml_diff>
--- a/disciplinas/model_based_design/entrega_docx/TEMPLATE ENTREGA DE TRABALHO - Model Based Design for Cyber-Physical Systems - ESTUDANTE.docx
+++ b/disciplinas/model_based_design/entrega_docx/TEMPLATE ENTREGA DE TRABALHO - Model Based Design for Cyber-Physical Systems - ESTUDANTE.docx
@@ -5488,7 +5488,7 @@
                 <w:b/>
                 <w:sz w:val="24"/>
               </w:rPr>
-              <w:t>3. Vídeo de apresentação — (25% da nota)</w:t>
+              <w:t>3. Vídeo Pitch — (25% da nota)</w:t>
             </w:r>
           </w:p>
           <w:p>
@@ -6190,7 +6190,7 @@
           <w:b/>
           <w:sz w:val="24"/>
         </w:rPr>
-        <w:t>2. Pesquise</w:t>
+        <w:t>2. Fontes de Pesquisa</w:t>
       </w:r>
     </w:p>
     <w:p>

</xml_diff>